<commit_message>
ci: update document file with latest changes
</commit_message>
<xml_diff>
--- a/3a20629b-5560-41b8-9fec-4f57d5e8370b.docx
+++ b/3a20629b-5560-41b8-9fec-4f57d5e8370b.docx
@@ -1,6 +1,6 @@
 
 <file path=word/document.xml><?xml version="1.0" encoding="utf-8"?>
-<w:document xmlns:wpc="http://schemas.microsoft.com/office/word/2010/wordprocessingCanvas" xmlns:cx="http://schemas.microsoft.com/office/drawing/2014/chartex" xmlns:cx1="http://schemas.microsoft.com/office/drawing/2015/9/8/chartex" xmlns:cx2="http://schemas.microsoft.com/office/drawing/2015/10/21/chartex" xmlns:cx3="http://schemas.microsoft.com/office/drawing/2016/5/9/chartex" xmlns:cx4="http://schemas.microsoft.com/office/drawing/2016/5/10/chartex" xmlns:cx5="http://schemas.microsoft.com/office/drawing/2016/5/11/chartex" xmlns:cx6="http://schemas.microsoft.com/office/drawing/2016/5/12/chartex" xmlns:cx7="http://schemas.microsoft.com/office/drawing/2016/5/13/chartex" xmlns:cx8="http://schemas.microsoft.com/office/drawing/2016/5/14/chartex" xmlns:mc="http://schemas.openxmlformats.org/markup-compatibility/2006" xmlns:aink="http://schemas.microsoft.com/office/drawing/2016/ink" xmlns:am3d="http://schemas.microsoft.com/office/drawing/2017/model3d" xmlns:o="urn:schemas-microsoft-com:office:office" xmlns:oel="http://schemas.microsoft.com/office/2019/extlst" xmlns:r="http://schemas.openxmlformats.org/officeDocument/2006/relationships" xmlns:m="http://schemas.openxmlformats.org/officeDocument/2006/math" xmlns:v="urn:schemas-microsoft-com:vml" xmlns:wp14="http://schemas.microsoft.com/office/word/2010/wordprocessingDrawing" xmlns:wp="http://schemas.openxmlformats.org/drawingml/2006/wordprocessingDrawing" xmlns:w10="urn:schemas-microsoft-com:office:word" xmlns:w="http://schemas.openxmlformats.org/wordprocessingml/2006/main" xmlns:w14="http://schemas.microsoft.com/office/word/2010/wordml" xmlns:w15="http://schemas.microsoft.com/office/word/2012/wordml" xmlns:w16cex="http://schemas.microsoft.com/office/word/2018/wordml/cex" xmlns:w16cid="http://schemas.microsoft.com/office/word/2016/wordml/cid" xmlns:w16="http://schemas.microsoft.com/office/word/2018/wordml" xmlns:w16du="http://schemas.microsoft.com/office/word/2023/wordml/word16du" xmlns:w16sdtdh="http://schemas.microsoft.com/office/word/2020/wordml/sdtdatahash" xmlns:w16sdtfl="http://schemas.microsoft.com/office/word/2024/wordml/sdtformatlock" xmlns:w16se="http://schemas.microsoft.com/office/word/2015/wordml/symex" xmlns:wpg="http://schemas.microsoft.com/office/word/2010/wordprocessingGroup" xmlns:wpi="http://schemas.microsoft.com/office/word/2010/wordprocessingInk" xmlns:wne="http://schemas.microsoft.com/office/word/2006/wordml" xmlns:wps="http://schemas.microsoft.com/office/word/2010/wordprocessingShape" mc:Ignorable="w14 w15 w16se w16cid w16 w16cex w16sdtdh w16sdtfl w16du wp14">
+<w:document xmlns:wpc="http://schemas.microsoft.com/office/word/2010/wordprocessingCanvas" xmlns:cx="http://schemas.microsoft.com/office/drawing/2014/chartex" xmlns:cx1="http://schemas.microsoft.com/office/drawing/2015/9/8/chartex" xmlns:cx2="http://schemas.microsoft.com/office/drawing/2015/10/21/chartex" xmlns:cx3="http://schemas.microsoft.com/office/drawing/2016/5/9/chartex" xmlns:cx4="http://schemas.microsoft.com/office/drawing/2016/5/10/chartex" xmlns:cx5="http://schemas.microsoft.com/office/drawing/2016/5/11/chartex" xmlns:cx6="http://schemas.microsoft.com/office/drawing/2016/5/12/chartex" xmlns:cx7="http://schemas.microsoft.com/office/drawing/2016/5/13/chartex" xmlns:cx8="http://schemas.microsoft.com/office/drawing/2016/5/14/chartex" xmlns:mc="http://schemas.openxmlformats.org/markup-compatibility/2006" xmlns:m="http://schemas.openxmlformats.org/officeDocument/2006/math" xmlns:aink="http://schemas.microsoft.com/office/drawing/2016/ink" xmlns:am3d="http://schemas.microsoft.com/office/drawing/2017/model3d" xmlns:oel="http://schemas.microsoft.com/office/2019/extlst" xmlns:r="http://schemas.openxmlformats.org/officeDocument/2006/relationships" xmlns:wp14="http://schemas.microsoft.com/office/word/2010/wordprocessingDrawing" xmlns:wp="http://schemas.openxmlformats.org/drawingml/2006/wordprocessingDrawing" xmlns:wpg="http://schemas.microsoft.com/office/word/2010/wordprocessingGroup" xmlns:wpi="http://schemas.microsoft.com/office/word/2010/wordprocessingInk" xmlns:wps="http://schemas.microsoft.com/office/word/2010/wordprocessingShape" xmlns:o="urn:schemas-microsoft-com:office:office" xmlns:v="urn:schemas-microsoft-com:vml" xmlns:w10="urn:schemas-microsoft-com:office:word" xmlns:w="http://schemas.openxmlformats.org/wordprocessingml/2006/main" xmlns:w14="http://schemas.microsoft.com/office/word/2010/wordml" xmlns:w15="http://schemas.microsoft.com/office/word/2012/wordml" xmlns:w16cex="http://schemas.microsoft.com/office/word/2018/wordml/cex" xmlns:w16cid="http://schemas.microsoft.com/office/word/2016/wordml/cid" xmlns:w16="http://schemas.microsoft.com/office/word/2018/wordml" xmlns:w16sdtdh="http://schemas.microsoft.com/office/word/2020/wordml/sdtdatahash" xmlns:w16sdtfl="http://schemas.microsoft.com/office/word/2024/wordml/sdtformatlock" xmlns:w16se="http://schemas.microsoft.com/office/word/2015/wordml/symex" xmlns:w16du="http://schemas.microsoft.com/office/word/2023/wordml/word16du" xmlns:wne="http://schemas.microsoft.com/office/word/2006/wordml" mc:Ignorable="w14 w15 w16se w16cid w16 w16cex w16sdtdh w16sdtfl w16du wp14">
   <w:body>
     <w:p>
       <w:pPr>
@@ -40,7 +40,7 @@
         <w:rPr>
           <w:lang w:val="es-CR"/>
         </w:rPr>
-        <w:t>Laboratorio introductorio · Duración estimada de 35 a 45 minutos</w:t>
+        <w:t>FRANDER CARRILLO TORRES</w:t>
       </w:r>
     </w:p>
     <w:p>
@@ -53,6 +53,19 @@
         <w:rPr>
           <w:lang w:val="es-CR"/>
         </w:rPr>
+        <w:t>Laboratorio introductorio · Duración estimada de 35 a 45 minutos</w:t>
+      </w:r>
+    </w:p>
+    <w:p>
+      <w:pPr>
+        <w:rPr>
+          <w:lang w:val="es-CR"/>
+        </w:rPr>
+      </w:pPr>
+      <w:r>
+        <w:rPr>
+          <w:lang w:val="es-CR"/>
+        </w:rPr>
         <w:t xml:space="preserve">Publicarás el chat en Render y crearás un </w:t>
       </w:r>
       <w:proofErr w:type="spellStart"/>
@@ -81,21 +94,7 @@
         <w:rPr>
           <w:lang w:val="es-CR"/>
         </w:rPr>
-        <w:t xml:space="preserve"> que solicite un despliegue cada vez que actualices la rama </w:t>
-      </w:r>
-      <w:proofErr w:type="gramStart"/>
-      <w:r>
-        <w:rPr>
-          <w:lang w:val="es-CR"/>
-        </w:rPr>
-        <w:t>master</w:t>
-      </w:r>
-      <w:proofErr w:type="gramEnd"/>
-      <w:r>
-        <w:rPr>
-          <w:lang w:val="es-CR"/>
-        </w:rPr>
-        <w:t>. Al final investigarás cómo incorporar pruebas al pipeline.</w:t>
+        <w:t xml:space="preserve"> que solicite un despliegue cada vez que actualices la rama master. Al final investigarás cómo incorporar pruebas al pipeline.</w:t>
       </w:r>
     </w:p>
     <w:p>
@@ -122,21 +121,7 @@
         <w:rPr>
           <w:lang w:val="es-CR"/>
         </w:rPr>
-        <w:t xml:space="preserve">Necesitas una cuenta de GitHub y una copia del proyecto en tu cuenta. Si aún no la tienes, abre el repositorio base y selecciona Fork. Trabaja en tu copia y conserva la rama </w:t>
-      </w:r>
-      <w:proofErr w:type="gramStart"/>
-      <w:r>
-        <w:rPr>
-          <w:lang w:val="es-CR"/>
-        </w:rPr>
-        <w:t>master</w:t>
-      </w:r>
-      <w:proofErr w:type="gramEnd"/>
-      <w:r>
-        <w:rPr>
-          <w:lang w:val="es-CR"/>
-        </w:rPr>
-        <w:t>.</w:t>
+        <w:t>Necesitas una cuenta de GitHub y una copia del proyecto en tu cuenta. Si aún no la tienes, abre el repositorio base y selecciona Fork. Trabaja en tu copia y conserva la rama master.</w:t>
       </w:r>
     </w:p>
     <w:p>
@@ -166,21 +151,7 @@
         <w:rPr>
           <w:lang w:val="es-CR"/>
         </w:rPr>
-        <w:t xml:space="preserve">1 </w:t>
-      </w:r>
-      <w:proofErr w:type="gramStart"/>
-      <w:r>
-        <w:rPr>
-          <w:lang w:val="es-CR"/>
-        </w:rPr>
-        <w:t>Crear</w:t>
-      </w:r>
-      <w:proofErr w:type="gramEnd"/>
-      <w:r>
-        <w:rPr>
-          <w:lang w:val="es-CR"/>
-        </w:rPr>
-        <w:t xml:space="preserve"> la cuenta y el servicio en Render</w:t>
+        <w:t>1 Crear la cuenta y el servicio en Render</w:t>
       </w:r>
     </w:p>
     <w:p>
@@ -406,7 +377,6 @@
               <w:t xml:space="preserve">Vacío si </w:t>
             </w:r>
             <w:proofErr w:type="spellStart"/>
-            <w:proofErr w:type="gramStart"/>
             <w:r>
               <w:rPr>
                 <w:sz w:val="20"/>
@@ -415,7 +385,6 @@
               <w:t>package.json</w:t>
             </w:r>
             <w:proofErr w:type="spellEnd"/>
-            <w:proofErr w:type="gramEnd"/>
             <w:r>
               <w:rPr>
                 <w:sz w:val="20"/>
@@ -677,21 +646,7 @@
         <w:rPr>
           <w:lang w:val="es-CR"/>
         </w:rPr>
-        <w:t xml:space="preserve">2 </w:t>
-      </w:r>
-      <w:proofErr w:type="gramStart"/>
-      <w:r>
-        <w:rPr>
-          <w:lang w:val="es-CR"/>
-        </w:rPr>
-        <w:t>Guardar</w:t>
-      </w:r>
-      <w:proofErr w:type="gramEnd"/>
-      <w:r>
-        <w:rPr>
-          <w:lang w:val="es-CR"/>
-        </w:rPr>
-        <w:t xml:space="preserve"> el secreto en GitHub</w:t>
+        <w:t>2 Guardar el secreto en GitHub</w:t>
       </w:r>
     </w:p>
     <w:p>
@@ -743,6 +698,7 @@
       </w:pPr>
       <w:r>
         <w:rPr>
+          <w:noProof/>
           <w:lang w:val="es-CR"/>
         </w:rPr>
         <w:drawing>
@@ -790,24 +746,86 @@
       </w:pPr>
     </w:p>
     <w:p>
-      <w:r>
-        <w:t xml:space="preserve">En </w:t>
+      <w:pPr>
+        <w:rPr>
+          <w:lang w:val="es-ES"/>
+        </w:rPr>
+      </w:pPr>
+      <w:r>
+        <w:rPr>
+          <w:lang w:val="es-ES"/>
+        </w:rPr>
+        <w:t xml:space="preserve">En tu repositorio de GitHub, abre </w:t>
       </w:r>
       <w:proofErr w:type="spellStart"/>
       <w:r>
-        <w:t>tu</w:t>
+        <w:rPr>
+          <w:lang w:val="es-ES"/>
+        </w:rPr>
+        <w:t>Settings</w:t>
       </w:r>
       <w:proofErr w:type="spellEnd"/>
       <w:r>
+        <w:rPr>
+          <w:lang w:val="es-ES"/>
+        </w:rPr>
+        <w:t xml:space="preserve"> → </w:t>
+      </w:r>
+      <w:proofErr w:type="spellStart"/>
+      <w:r>
+        <w:rPr>
+          <w:lang w:val="es-ES"/>
+        </w:rPr>
+        <w:t>Secrets</w:t>
+      </w:r>
+      <w:proofErr w:type="spellEnd"/>
+      <w:r>
+        <w:rPr>
+          <w:lang w:val="es-ES"/>
+        </w:rPr>
+        <w:t xml:space="preserve"> and variables → </w:t>
+      </w:r>
+      <w:proofErr w:type="spellStart"/>
+      <w:r>
+        <w:rPr>
+          <w:lang w:val="es-ES"/>
+        </w:rPr>
+        <w:t>Actions</w:t>
+      </w:r>
+      <w:proofErr w:type="spellEnd"/>
+      <w:r>
+        <w:rPr>
+          <w:lang w:val="es-ES"/>
+        </w:rPr>
+        <w:t xml:space="preserve"> → New </w:t>
+      </w:r>
+      <w:proofErr w:type="spellStart"/>
+      <w:r>
+        <w:rPr>
+          <w:lang w:val="es-ES"/>
+        </w:rPr>
+        <w:t>repository</w:t>
+      </w:r>
+      <w:proofErr w:type="spellEnd"/>
+      <w:r>
+        <w:rPr>
+          <w:lang w:val="es-ES"/>
+        </w:rPr>
         <w:t xml:space="preserve"> </w:t>
       </w:r>
       <w:proofErr w:type="spellStart"/>
       <w:r>
-        <w:t>repositorio</w:t>
+        <w:rPr>
+          <w:lang w:val="es-ES"/>
+        </w:rPr>
+        <w:t>secret</w:t>
       </w:r>
       <w:proofErr w:type="spellEnd"/>
       <w:r>
-        <w:t xml:space="preserve"> de GitHub, abre Settings → Secrets and variables → Actions → New repository secret.</w:t>
+        <w:rPr>
+          <w:lang w:val="es-ES"/>
+        </w:rPr>
+        <w:t>.</w:t>
       </w:r>
     </w:p>
     <w:p>
@@ -852,6 +870,7 @@
       </w:pPr>
       <w:r>
         <w:rPr>
+          <w:noProof/>
           <w:lang w:val="es-CR"/>
         </w:rPr>
         <w:lastRenderedPageBreak/>
@@ -930,21 +949,7 @@
           <w:lang w:val="es-CR"/>
         </w:rPr>
         <w:lastRenderedPageBreak/>
-        <w:t xml:space="preserve">3 </w:t>
-      </w:r>
-      <w:proofErr w:type="gramStart"/>
-      <w:r>
-        <w:rPr>
-          <w:lang w:val="es-CR"/>
-        </w:rPr>
-        <w:t>Crear</w:t>
-      </w:r>
-      <w:proofErr w:type="gramEnd"/>
-      <w:r>
-        <w:rPr>
-          <w:lang w:val="es-CR"/>
-        </w:rPr>
-        <w:t xml:space="preserve"> el </w:t>
+        <w:t xml:space="preserve">3 Crear el </w:t>
       </w:r>
       <w:proofErr w:type="spellStart"/>
       <w:r>
@@ -1042,645 +1047,281 @@
       <w:pPr>
         <w:keepLines/>
         <w:spacing w:before="60" w:after="140" w:line="240" w:lineRule="auto"/>
-        <w:rPr>
-          <w:lang w:val="es-CR"/>
-        </w:rPr>
       </w:pPr>
       <w:bookmarkStart w:id="0" w:name="_Hlk243660648"/>
-      <w:proofErr w:type="spellStart"/>
       <w:r>
         <w:rPr>
           <w:rFonts w:ascii="Consolas" w:hAnsi="Consolas"/>
           <w:sz w:val="18"/>
-          <w:lang w:val="es-CR"/>
-        </w:rPr>
-        <w:t>name</w:t>
-      </w:r>
-      <w:proofErr w:type="spellEnd"/>
+        </w:rPr>
+        <w:t xml:space="preserve">name: </w:t>
+      </w:r>
+      <w:proofErr w:type="spellStart"/>
       <w:r>
         <w:rPr>
           <w:rFonts w:ascii="Consolas" w:hAnsi="Consolas"/>
           <w:sz w:val="18"/>
-          <w:lang w:val="es-CR"/>
-        </w:rPr>
-        <w:t>: Desplegar chat en Render</w:t>
-      </w:r>
+        </w:rPr>
+        <w:t>Desplegar</w:t>
+      </w:r>
+      <w:proofErr w:type="spellEnd"/>
       <w:r>
         <w:rPr>
           <w:rFonts w:ascii="Consolas" w:hAnsi="Consolas"/>
           <w:sz w:val="18"/>
-          <w:lang w:val="es-CR"/>
-        </w:rPr>
-        <w:br/>
-      </w:r>
+        </w:rPr>
+        <w:t xml:space="preserve"> chat </w:t>
+      </w:r>
+      <w:proofErr w:type="spellStart"/>
       <w:r>
         <w:rPr>
           <w:rFonts w:ascii="Consolas" w:hAnsi="Consolas"/>
           <w:sz w:val="18"/>
-          <w:lang w:val="es-CR"/>
-        </w:rPr>
-        <w:br/>
-      </w:r>
-      <w:proofErr w:type="spellStart"/>
+        </w:rPr>
+        <w:t>en</w:t>
+      </w:r>
+      <w:proofErr w:type="spellEnd"/>
       <w:r>
         <w:rPr>
           <w:rFonts w:ascii="Consolas" w:hAnsi="Consolas"/>
           <w:sz w:val="18"/>
-          <w:lang w:val="es-CR"/>
-        </w:rPr>
-        <w:t>on</w:t>
-      </w:r>
-      <w:proofErr w:type="spellEnd"/>
+        </w:rPr>
+        <w:t xml:space="preserve"> Render</w:t>
+      </w:r>
       <w:r>
         <w:rPr>
           <w:rFonts w:ascii="Consolas" w:hAnsi="Consolas"/>
           <w:sz w:val="18"/>
-          <w:lang w:val="es-CR"/>
-        </w:rPr>
-        <w:t>:</w:t>
+        </w:rPr>
+        <w:br/>
       </w:r>
       <w:r>
         <w:rPr>
           <w:rFonts w:ascii="Consolas" w:hAnsi="Consolas"/>
           <w:sz w:val="18"/>
-          <w:lang w:val="es-CR"/>
         </w:rPr>
         <w:br/>
-        <w:t xml:space="preserve">  </w:t>
-      </w:r>
-      <w:proofErr w:type="spellStart"/>
+        <w:t>on:</w:t>
+      </w:r>
       <w:r>
         <w:rPr>
           <w:rFonts w:ascii="Consolas" w:hAnsi="Consolas"/>
           <w:sz w:val="18"/>
-          <w:lang w:val="es-CR"/>
-        </w:rPr>
-        <w:t>push</w:t>
-      </w:r>
-      <w:proofErr w:type="spellEnd"/>
+        </w:rPr>
+        <w:br/>
+        <w:t xml:space="preserve">  push:</w:t>
+      </w:r>
       <w:r>
         <w:rPr>
           <w:rFonts w:ascii="Consolas" w:hAnsi="Consolas"/>
           <w:sz w:val="18"/>
-          <w:lang w:val="es-CR"/>
-        </w:rPr>
-        <w:t>:</w:t>
+        </w:rPr>
+        <w:br/>
+        <w:t xml:space="preserve">    branches: [master]</w:t>
       </w:r>
       <w:r>
         <w:rPr>
           <w:rFonts w:ascii="Consolas" w:hAnsi="Consolas"/>
           <w:sz w:val="18"/>
-          <w:lang w:val="es-CR"/>
         </w:rPr>
         <w:br/>
-        <w:t xml:space="preserve">    </w:t>
-      </w:r>
-      <w:proofErr w:type="spellStart"/>
+      </w:r>
       <w:r>
         <w:rPr>
           <w:rFonts w:ascii="Consolas" w:hAnsi="Consolas"/>
           <w:sz w:val="18"/>
-          <w:lang w:val="es-CR"/>
-        </w:rPr>
-        <w:t>branches</w:t>
-      </w:r>
-      <w:proofErr w:type="spellEnd"/>
+        </w:rPr>
+        <w:br/>
+        <w:t>permissions:</w:t>
+      </w:r>
       <w:r>
         <w:rPr>
           <w:rFonts w:ascii="Consolas" w:hAnsi="Consolas"/>
           <w:sz w:val="18"/>
-          <w:lang w:val="es-CR"/>
-        </w:rPr>
-        <w:t>: [</w:t>
-      </w:r>
-      <w:proofErr w:type="gramStart"/>
+        </w:rPr>
+        <w:br/>
+        <w:t xml:space="preserve">  contents: read</w:t>
+      </w:r>
       <w:r>
         <w:rPr>
           <w:rFonts w:ascii="Consolas" w:hAnsi="Consolas"/>
           <w:sz w:val="18"/>
-          <w:lang w:val="es-CR"/>
-        </w:rPr>
-        <w:t>master</w:t>
-      </w:r>
-      <w:proofErr w:type="gramEnd"/>
+        </w:rPr>
+        <w:br/>
+      </w:r>
       <w:r>
         <w:rPr>
           <w:rFonts w:ascii="Consolas" w:hAnsi="Consolas"/>
           <w:sz w:val="18"/>
-          <w:lang w:val="es-CR"/>
-        </w:rPr>
-        <w:t>]</w:t>
+        </w:rPr>
+        <w:br/>
+        <w:t>jobs:</w:t>
       </w:r>
       <w:r>
         <w:rPr>
           <w:rFonts w:ascii="Consolas" w:hAnsi="Consolas"/>
           <w:sz w:val="18"/>
-          <w:lang w:val="es-CR"/>
         </w:rPr>
         <w:br/>
+        <w:t xml:space="preserve">  deploy:</w:t>
       </w:r>
       <w:r>
         <w:rPr>
           <w:rFonts w:ascii="Consolas" w:hAnsi="Consolas"/>
           <w:sz w:val="18"/>
-          <w:lang w:val="es-CR"/>
         </w:rPr>
         <w:br/>
-      </w:r>
-      <w:proofErr w:type="spellStart"/>
+        <w:t xml:space="preserve">    runs-on: ubuntu-latest</w:t>
+      </w:r>
       <w:r>
         <w:rPr>
           <w:rFonts w:ascii="Consolas" w:hAnsi="Consolas"/>
           <w:sz w:val="18"/>
-          <w:lang w:val="es-CR"/>
-        </w:rPr>
-        <w:t>permissions</w:t>
-      </w:r>
-      <w:proofErr w:type="spellEnd"/>
+        </w:rPr>
+        <w:br/>
+        <w:t xml:space="preserve">    steps:</w:t>
+      </w:r>
       <w:r>
         <w:rPr>
           <w:rFonts w:ascii="Consolas" w:hAnsi="Consolas"/>
           <w:sz w:val="18"/>
-          <w:lang w:val="es-CR"/>
-        </w:rPr>
-        <w:t>:</w:t>
-      </w:r>
+        </w:rPr>
+        <w:br/>
+        <w:t xml:space="preserve">      - name: </w:t>
+      </w:r>
+      <w:proofErr w:type="spellStart"/>
       <w:r>
         <w:rPr>
           <w:rFonts w:ascii="Consolas" w:hAnsi="Consolas"/>
           <w:sz w:val="18"/>
-          <w:lang w:val="es-CR"/>
-        </w:rPr>
-        <w:br/>
-        <w:t xml:space="preserve">  </w:t>
-      </w:r>
-      <w:proofErr w:type="spellStart"/>
+        </w:rPr>
+        <w:t>Solicitar</w:t>
+      </w:r>
+      <w:proofErr w:type="spellEnd"/>
       <w:r>
         <w:rPr>
           <w:rFonts w:ascii="Consolas" w:hAnsi="Consolas"/>
           <w:sz w:val="18"/>
-          <w:lang w:val="es-CR"/>
-        </w:rPr>
-        <w:t>contents</w:t>
-      </w:r>
-      <w:proofErr w:type="spellEnd"/>
+        </w:rPr>
+        <w:t xml:space="preserve"> </w:t>
+      </w:r>
+      <w:proofErr w:type="spellStart"/>
       <w:r>
         <w:rPr>
           <w:rFonts w:ascii="Consolas" w:hAnsi="Consolas"/>
           <w:sz w:val="18"/>
-          <w:lang w:val="es-CR"/>
-        </w:rPr>
-        <w:t xml:space="preserve">: </w:t>
-      </w:r>
-      <w:proofErr w:type="spellStart"/>
+        </w:rPr>
+        <w:t>despliegue</w:t>
+      </w:r>
+      <w:proofErr w:type="spellEnd"/>
       <w:r>
         <w:rPr>
           <w:rFonts w:ascii="Consolas" w:hAnsi="Consolas"/>
           <w:sz w:val="18"/>
-          <w:lang w:val="es-CR"/>
-        </w:rPr>
-        <w:t>read</w:t>
-      </w:r>
-      <w:proofErr w:type="spellEnd"/>
+        </w:rPr>
+        <w:br/>
+        <w:t xml:space="preserve">        env:</w:t>
+      </w:r>
       <w:r>
         <w:rPr>
           <w:rFonts w:ascii="Consolas" w:hAnsi="Consolas"/>
           <w:sz w:val="18"/>
-          <w:lang w:val="es-CR"/>
         </w:rPr>
         <w:br/>
-      </w:r>
+        <w:t xml:space="preserve">          RENDER_DEPLOY_HOOK_URL: $</w:t>
+      </w:r>
+      <w:proofErr w:type="gramStart"/>
       <w:r>
         <w:rPr>
           <w:rFonts w:ascii="Consolas" w:hAnsi="Consolas"/>
           <w:sz w:val="18"/>
-          <w:lang w:val="es-CR"/>
-        </w:rPr>
-        <w:br/>
+        </w:rPr>
+        <w:t xml:space="preserve">{{ </w:t>
       </w:r>
       <w:proofErr w:type="spellStart"/>
       <w:r>
         <w:rPr>
           <w:rFonts w:ascii="Consolas" w:hAnsi="Consolas"/>
           <w:sz w:val="18"/>
-          <w:lang w:val="es-CR"/>
-        </w:rPr>
-        <w:t>jobs</w:t>
-      </w:r>
-      <w:proofErr w:type="spellEnd"/>
+        </w:rPr>
+        <w:t>secrets</w:t>
+      </w:r>
+      <w:proofErr w:type="gramEnd"/>
       <w:r>
         <w:rPr>
           <w:rFonts w:ascii="Consolas" w:hAnsi="Consolas"/>
           <w:sz w:val="18"/>
-          <w:lang w:val="es-CR"/>
-        </w:rPr>
-        <w:t>:</w:t>
-      </w:r>
+        </w:rPr>
+        <w:t>.RENDER_DEPLOY_HOOK_URL</w:t>
+      </w:r>
+      <w:proofErr w:type="spellEnd"/>
       <w:r>
         <w:rPr>
           <w:rFonts w:ascii="Consolas" w:hAnsi="Consolas"/>
           <w:sz w:val="18"/>
-          <w:lang w:val="es-CR"/>
-        </w:rPr>
-        <w:br/>
-        <w:t xml:space="preserve">  </w:t>
-      </w:r>
-      <w:proofErr w:type="spellStart"/>
+        </w:rPr>
+        <w:t xml:space="preserve"> }}</w:t>
+      </w:r>
       <w:r>
         <w:rPr>
           <w:rFonts w:ascii="Consolas" w:hAnsi="Consolas"/>
           <w:sz w:val="18"/>
-          <w:lang w:val="es-CR"/>
-        </w:rPr>
-        <w:t>deploy</w:t>
-      </w:r>
-      <w:proofErr w:type="spellEnd"/>
+        </w:rPr>
+        <w:br/>
+        <w:t xml:space="preserve">        run: |</w:t>
+      </w:r>
       <w:r>
         <w:rPr>
           <w:rFonts w:ascii="Consolas" w:hAnsi="Consolas"/>
           <w:sz w:val="18"/>
-          <w:lang w:val="es-CR"/>
-        </w:rPr>
-        <w:t>:</w:t>
+        </w:rPr>
+        <w:br/>
+        <w:t xml:space="preserve">          curl --fail --silent --show-error --output /dev/null \</w:t>
       </w:r>
       <w:r>
         <w:rPr>
           <w:rFonts w:ascii="Consolas" w:hAnsi="Consolas"/>
           <w:sz w:val="18"/>
-          <w:lang w:val="es-CR"/>
         </w:rPr>
         <w:br/>
-        <w:t xml:space="preserve">    </w:t>
+        <w:t xml:space="preserve">            --get --data-</w:t>
       </w:r>
       <w:proofErr w:type="spellStart"/>
       <w:r>
         <w:rPr>
           <w:rFonts w:ascii="Consolas" w:hAnsi="Consolas"/>
           <w:sz w:val="18"/>
-          <w:lang w:val="es-CR"/>
-        </w:rPr>
-        <w:t>runs-on</w:t>
+        </w:rPr>
+        <w:t>urlencode</w:t>
       </w:r>
       <w:proofErr w:type="spellEnd"/>
       <w:r>
         <w:rPr>
           <w:rFonts w:ascii="Consolas" w:hAnsi="Consolas"/>
           <w:sz w:val="18"/>
-          <w:lang w:val="es-CR"/>
-        </w:rPr>
-        <w:t xml:space="preserve">: </w:t>
-      </w:r>
-      <w:proofErr w:type="spellStart"/>
+        </w:rPr>
+        <w:t xml:space="preserve"> "ref=${GITHUB_SHA}" \</w:t>
+      </w:r>
       <w:r>
         <w:rPr>
           <w:rFonts w:ascii="Consolas" w:hAnsi="Consolas"/>
           <w:sz w:val="18"/>
-          <w:lang w:val="es-CR"/>
-        </w:rPr>
-        <w:t>ubuntu-latest</w:t>
-      </w:r>
-      <w:proofErr w:type="spellEnd"/>
-      <w:r>
-        <w:rPr>
-          <w:rFonts w:ascii="Consolas" w:hAnsi="Consolas"/>
-          <w:sz w:val="18"/>
-          <w:lang w:val="es-CR"/>
-        </w:rPr>
-        <w:br/>
-        <w:t xml:space="preserve">    </w:t>
-      </w:r>
-      <w:proofErr w:type="spellStart"/>
-      <w:r>
-        <w:rPr>
-          <w:rFonts w:ascii="Consolas" w:hAnsi="Consolas"/>
-          <w:sz w:val="18"/>
-          <w:lang w:val="es-CR"/>
-        </w:rPr>
-        <w:t>steps</w:t>
-      </w:r>
-      <w:proofErr w:type="spellEnd"/>
-      <w:r>
-        <w:rPr>
-          <w:rFonts w:ascii="Consolas" w:hAnsi="Consolas"/>
-          <w:sz w:val="18"/>
-          <w:lang w:val="es-CR"/>
-        </w:rPr>
-        <w:t>:</w:t>
-      </w:r>
-      <w:r>
-        <w:rPr>
-          <w:rFonts w:ascii="Consolas" w:hAnsi="Consolas"/>
-          <w:sz w:val="18"/>
-          <w:lang w:val="es-CR"/>
-        </w:rPr>
-        <w:br/>
-        <w:t xml:space="preserve">      - </w:t>
-      </w:r>
-      <w:proofErr w:type="spellStart"/>
-      <w:r>
-        <w:rPr>
-          <w:rFonts w:ascii="Consolas" w:hAnsi="Consolas"/>
-          <w:sz w:val="18"/>
-          <w:lang w:val="es-CR"/>
-        </w:rPr>
-        <w:t>name</w:t>
-      </w:r>
-      <w:proofErr w:type="spellEnd"/>
-      <w:r>
-        <w:rPr>
-          <w:rFonts w:ascii="Consolas" w:hAnsi="Consolas"/>
-          <w:sz w:val="18"/>
-          <w:lang w:val="es-CR"/>
-        </w:rPr>
-        <w:t>: Solicitar despliegue</w:t>
-      </w:r>
-      <w:r>
-        <w:rPr>
-          <w:rFonts w:ascii="Consolas" w:hAnsi="Consolas"/>
-          <w:sz w:val="18"/>
-          <w:lang w:val="es-CR"/>
-        </w:rPr>
-        <w:br/>
-        <w:t xml:space="preserve">        </w:t>
-      </w:r>
-      <w:proofErr w:type="spellStart"/>
-      <w:r>
-        <w:rPr>
-          <w:rFonts w:ascii="Consolas" w:hAnsi="Consolas"/>
-          <w:sz w:val="18"/>
-          <w:lang w:val="es-CR"/>
-        </w:rPr>
-        <w:t>env</w:t>
-      </w:r>
-      <w:proofErr w:type="spellEnd"/>
-      <w:r>
-        <w:rPr>
-          <w:rFonts w:ascii="Consolas" w:hAnsi="Consolas"/>
-          <w:sz w:val="18"/>
-          <w:lang w:val="es-CR"/>
-        </w:rPr>
-        <w:t>:</w:t>
-      </w:r>
-      <w:r>
-        <w:rPr>
-          <w:rFonts w:ascii="Consolas" w:hAnsi="Consolas"/>
-          <w:sz w:val="18"/>
-          <w:lang w:val="es-CR"/>
-        </w:rPr>
-        <w:br/>
-        <w:t xml:space="preserve">          RENDER_DEPLOY_HOOK_URL: $</w:t>
-      </w:r>
-      <w:proofErr w:type="gramStart"/>
-      <w:r>
-        <w:rPr>
-          <w:rFonts w:ascii="Consolas" w:hAnsi="Consolas"/>
-          <w:sz w:val="18"/>
-          <w:lang w:val="es-CR"/>
-        </w:rPr>
-        <w:t xml:space="preserve">{{ </w:t>
-      </w:r>
-      <w:proofErr w:type="spellStart"/>
-      <w:r>
-        <w:rPr>
-          <w:rFonts w:ascii="Consolas" w:hAnsi="Consolas"/>
-          <w:sz w:val="18"/>
-          <w:lang w:val="es-CR"/>
-        </w:rPr>
-        <w:t>secrets</w:t>
-      </w:r>
-      <w:proofErr w:type="gramEnd"/>
-      <w:r>
-        <w:rPr>
-          <w:rFonts w:ascii="Consolas" w:hAnsi="Consolas"/>
-          <w:sz w:val="18"/>
-          <w:lang w:val="es-CR"/>
-        </w:rPr>
-        <w:t>.RENDER_DEPLOY_HOOK_URL</w:t>
-      </w:r>
-      <w:proofErr w:type="spellEnd"/>
-      <w:r>
-        <w:rPr>
-          <w:rFonts w:ascii="Consolas" w:hAnsi="Consolas"/>
-          <w:sz w:val="18"/>
-          <w:lang w:val="es-CR"/>
-        </w:rPr>
-        <w:t xml:space="preserve"> }}</w:t>
-      </w:r>
-      <w:r>
-        <w:rPr>
-          <w:rFonts w:ascii="Consolas" w:hAnsi="Consolas"/>
-          <w:sz w:val="18"/>
-          <w:lang w:val="es-CR"/>
-        </w:rPr>
-        <w:br/>
-        <w:t xml:space="preserve">        run: |</w:t>
-      </w:r>
-      <w:r>
-        <w:rPr>
-          <w:rFonts w:ascii="Consolas" w:hAnsi="Consolas"/>
-          <w:sz w:val="18"/>
-          <w:lang w:val="es-CR"/>
-        </w:rPr>
-        <w:br/>
-        <w:t xml:space="preserve">          </w:t>
-      </w:r>
-      <w:proofErr w:type="spellStart"/>
-      <w:r>
-        <w:rPr>
-          <w:rFonts w:ascii="Consolas" w:hAnsi="Consolas"/>
-          <w:sz w:val="18"/>
-          <w:lang w:val="es-CR"/>
-        </w:rPr>
-        <w:t>curl</w:t>
-      </w:r>
-      <w:proofErr w:type="spellEnd"/>
-      <w:r>
-        <w:rPr>
-          <w:rFonts w:ascii="Consolas" w:hAnsi="Consolas"/>
-          <w:sz w:val="18"/>
-          <w:lang w:val="es-CR"/>
-        </w:rPr>
-        <w:t xml:space="preserve"> --</w:t>
-      </w:r>
-      <w:proofErr w:type="spellStart"/>
-      <w:r>
-        <w:rPr>
-          <w:rFonts w:ascii="Consolas" w:hAnsi="Consolas"/>
-          <w:sz w:val="18"/>
-          <w:lang w:val="es-CR"/>
-        </w:rPr>
-        <w:t>fail</w:t>
-      </w:r>
-      <w:proofErr w:type="spellEnd"/>
-      <w:r>
-        <w:rPr>
-          <w:rFonts w:ascii="Consolas" w:hAnsi="Consolas"/>
-          <w:sz w:val="18"/>
-          <w:lang w:val="es-CR"/>
-        </w:rPr>
-        <w:t xml:space="preserve"> --</w:t>
-      </w:r>
-      <w:proofErr w:type="spellStart"/>
-      <w:r>
-        <w:rPr>
-          <w:rFonts w:ascii="Consolas" w:hAnsi="Consolas"/>
-          <w:sz w:val="18"/>
-          <w:lang w:val="es-CR"/>
-        </w:rPr>
-        <w:t>silent</w:t>
-      </w:r>
-      <w:proofErr w:type="spellEnd"/>
-      <w:r>
-        <w:rPr>
-          <w:rFonts w:ascii="Consolas" w:hAnsi="Consolas"/>
-          <w:sz w:val="18"/>
-          <w:lang w:val="es-CR"/>
-        </w:rPr>
-        <w:t xml:space="preserve"> --</w:t>
-      </w:r>
-      <w:proofErr w:type="gramStart"/>
-      <w:r>
-        <w:rPr>
-          <w:rFonts w:ascii="Consolas" w:hAnsi="Consolas"/>
-          <w:sz w:val="18"/>
-          <w:lang w:val="es-CR"/>
-        </w:rPr>
-        <w:t>show</w:t>
-      </w:r>
-      <w:proofErr w:type="gramEnd"/>
-      <w:r>
-        <w:rPr>
-          <w:rFonts w:ascii="Consolas" w:hAnsi="Consolas"/>
-          <w:sz w:val="18"/>
-          <w:lang w:val="es-CR"/>
-        </w:rPr>
-        <w:t>-error --output /</w:t>
-      </w:r>
-      <w:proofErr w:type="spellStart"/>
-      <w:r>
-        <w:rPr>
-          <w:rFonts w:ascii="Consolas" w:hAnsi="Consolas"/>
-          <w:sz w:val="18"/>
-          <w:lang w:val="es-CR"/>
-        </w:rPr>
-        <w:t>dev</w:t>
-      </w:r>
-      <w:proofErr w:type="spellEnd"/>
-      <w:r>
-        <w:rPr>
-          <w:rFonts w:ascii="Consolas" w:hAnsi="Consolas"/>
-          <w:sz w:val="18"/>
-          <w:lang w:val="es-CR"/>
-        </w:rPr>
-        <w:t>/</w:t>
-      </w:r>
-      <w:proofErr w:type="spellStart"/>
-      <w:r>
-        <w:rPr>
-          <w:rFonts w:ascii="Consolas" w:hAnsi="Consolas"/>
-          <w:sz w:val="18"/>
-          <w:lang w:val="es-CR"/>
-        </w:rPr>
-        <w:t>null</w:t>
-      </w:r>
-      <w:proofErr w:type="spellEnd"/>
-      <w:r>
-        <w:rPr>
-          <w:rFonts w:ascii="Consolas" w:hAnsi="Consolas"/>
-          <w:sz w:val="18"/>
-          <w:lang w:val="es-CR"/>
-        </w:rPr>
-        <w:t xml:space="preserve"> \</w:t>
-      </w:r>
-      <w:r>
-        <w:rPr>
-          <w:rFonts w:ascii="Consolas" w:hAnsi="Consolas"/>
-          <w:sz w:val="18"/>
-          <w:lang w:val="es-CR"/>
-        </w:rPr>
-        <w:br/>
-        <w:t xml:space="preserve">            --</w:t>
-      </w:r>
-      <w:proofErr w:type="spellStart"/>
-      <w:r>
-        <w:rPr>
-          <w:rFonts w:ascii="Consolas" w:hAnsi="Consolas"/>
-          <w:sz w:val="18"/>
-          <w:lang w:val="es-CR"/>
-        </w:rPr>
-        <w:t>get</w:t>
-      </w:r>
-      <w:proofErr w:type="spellEnd"/>
-      <w:r>
-        <w:rPr>
-          <w:rFonts w:ascii="Consolas" w:hAnsi="Consolas"/>
-          <w:sz w:val="18"/>
-          <w:lang w:val="es-CR"/>
-        </w:rPr>
-        <w:t xml:space="preserve"> --data-</w:t>
-      </w:r>
-      <w:proofErr w:type="spellStart"/>
-      <w:r>
-        <w:rPr>
-          <w:rFonts w:ascii="Consolas" w:hAnsi="Consolas"/>
-          <w:sz w:val="18"/>
-          <w:lang w:val="es-CR"/>
-        </w:rPr>
-        <w:t>urlencode</w:t>
-      </w:r>
-      <w:proofErr w:type="spellEnd"/>
-      <w:r>
-        <w:rPr>
-          <w:rFonts w:ascii="Consolas" w:hAnsi="Consolas"/>
-          <w:sz w:val="18"/>
-          <w:lang w:val="es-CR"/>
-        </w:rPr>
-        <w:t xml:space="preserve"> "</w:t>
-      </w:r>
-      <w:proofErr w:type="spellStart"/>
-      <w:r>
-        <w:rPr>
-          <w:rFonts w:ascii="Consolas" w:hAnsi="Consolas"/>
-          <w:sz w:val="18"/>
-          <w:lang w:val="es-CR"/>
-        </w:rPr>
-        <w:t>ref</w:t>
-      </w:r>
-      <w:proofErr w:type="spellEnd"/>
-      <w:r>
-        <w:rPr>
-          <w:rFonts w:ascii="Consolas" w:hAnsi="Consolas"/>
-          <w:sz w:val="18"/>
-          <w:lang w:val="es-CR"/>
-        </w:rPr>
-        <w:t>=${GITHUB_SHA}" \</w:t>
-      </w:r>
-      <w:r>
-        <w:rPr>
-          <w:rFonts w:ascii="Consolas" w:hAnsi="Consolas"/>
-          <w:sz w:val="18"/>
-          <w:lang w:val="es-CR"/>
         </w:rPr>
         <w:br/>
         <w:t xml:space="preserve">            "$RENDER_DEPLOY_HOOK_URL"</w:t>
       </w:r>
     </w:p>
     <w:bookmarkEnd w:id="0"/>
+    <w:p/>
     <w:p>
       <w:pPr>
         <w:rPr>
           <w:lang w:val="es-CR"/>
         </w:rPr>
       </w:pPr>
-    </w:p>
-    <w:p>
-      <w:pPr>
-        <w:rPr>
-          <w:lang w:val="es-CR"/>
-        </w:rPr>
-      </w:pPr>
-      <w:r>
-        <w:rPr>
+      <w:r>
+        <w:rPr>
+          <w:noProof/>
           <w:lang w:val="es-CR"/>
         </w:rPr>
         <w:drawing>
@@ -1758,49 +1399,21 @@
         <w:rPr>
           <w:lang w:val="es-CR"/>
         </w:rPr>
-        <w:t xml:space="preserve"> en </w:t>
-      </w:r>
-      <w:proofErr w:type="gramStart"/>
+        <w:t xml:space="preserve"> en master. Si tu rama se llama </w:t>
+      </w:r>
+      <w:proofErr w:type="spellStart"/>
       <w:r>
         <w:rPr>
           <w:lang w:val="es-CR"/>
         </w:rPr>
-        <w:t>master</w:t>
-      </w:r>
-      <w:proofErr w:type="gramEnd"/>
+        <w:t>main</w:t>
+      </w:r>
+      <w:proofErr w:type="spellEnd"/>
       <w:r>
         <w:rPr>
           <w:lang w:val="es-CR"/>
         </w:rPr>
-        <w:t xml:space="preserve">. Si tu rama se llama </w:t>
-      </w:r>
-      <w:proofErr w:type="spellStart"/>
-      <w:r>
-        <w:rPr>
-          <w:lang w:val="es-CR"/>
-        </w:rPr>
-        <w:t>main</w:t>
-      </w:r>
-      <w:proofErr w:type="spellEnd"/>
-      <w:r>
-        <w:rPr>
-          <w:lang w:val="es-CR"/>
-        </w:rPr>
-        <w:t xml:space="preserve">, cambia </w:t>
-      </w:r>
-      <w:proofErr w:type="gramStart"/>
-      <w:r>
-        <w:rPr>
-          <w:lang w:val="es-CR"/>
-        </w:rPr>
-        <w:t>master</w:t>
-      </w:r>
-      <w:proofErr w:type="gramEnd"/>
-      <w:r>
-        <w:rPr>
-          <w:lang w:val="es-CR"/>
-        </w:rPr>
-        <w:t xml:space="preserve"> por </w:t>
+        <w:t xml:space="preserve">, cambia master por </w:t>
       </w:r>
       <w:proofErr w:type="spellStart"/>
       <w:r>
@@ -1919,21 +1532,7 @@
         <w:rPr>
           <w:lang w:val="es-CR"/>
         </w:rPr>
-        <w:t xml:space="preserve">4 </w:t>
-      </w:r>
-      <w:proofErr w:type="gramStart"/>
-      <w:r>
-        <w:rPr>
-          <w:lang w:val="es-CR"/>
-        </w:rPr>
-        <w:t>Comprobar</w:t>
-      </w:r>
-      <w:proofErr w:type="gramEnd"/>
-      <w:r>
-        <w:rPr>
-          <w:lang w:val="es-CR"/>
-        </w:rPr>
-        <w:t xml:space="preserve"> el despliegue</w:t>
+        <w:t>4 Comprobar el despliegue</w:t>
       </w:r>
     </w:p>
     <w:p>
@@ -2002,21 +1601,7 @@
         <w:rPr>
           <w:lang w:val="es-CR"/>
         </w:rPr>
-        <w:t xml:space="preserve"> en </w:t>
-      </w:r>
-      <w:proofErr w:type="gramStart"/>
-      <w:r>
-        <w:rPr>
-          <w:lang w:val="es-CR"/>
-        </w:rPr>
-        <w:t>master</w:t>
-      </w:r>
-      <w:proofErr w:type="gramEnd"/>
-      <w:r>
-        <w:rPr>
-          <w:lang w:val="es-CR"/>
-        </w:rPr>
-        <w:t xml:space="preserve"> para activar el flujo.</w:t>
+        <w:t xml:space="preserve"> en master para activar el flujo.</w:t>
       </w:r>
     </w:p>
     <w:p>
@@ -2136,7 +1721,6 @@
         <w:t xml:space="preserve"> y modifica el pipeline para que un fallo impida el despliegue. Usa los scripts de </w:t>
       </w:r>
       <w:proofErr w:type="spellStart"/>
-      <w:proofErr w:type="gramStart"/>
       <w:r>
         <w:rPr>
           <w:lang w:val="es-CR"/>
@@ -2144,7 +1728,6 @@
         <w:t>package.json</w:t>
       </w:r>
       <w:proofErr w:type="spellEnd"/>
-      <w:proofErr w:type="gramEnd"/>
       <w:r>
         <w:rPr>
           <w:lang w:val="es-CR"/>
@@ -2226,6 +1809,250 @@
           <w:t>Plan Free</w:t>
         </w:r>
       </w:hyperlink>
+    </w:p>
+    <w:p>
+      <w:pPr>
+        <w:spacing w:before="80"/>
+      </w:pPr>
+    </w:p>
+    <w:p>
+      <w:pPr>
+        <w:spacing w:before="80"/>
+      </w:pPr>
+    </w:p>
+    <w:p>
+      <w:pPr>
+        <w:spacing w:before="80"/>
+      </w:pPr>
+      <w:r>
+        <w:rPr>
+          <w:noProof/>
+        </w:rPr>
+        <w:drawing>
+          <wp:inline distT="0" distB="0" distL="0" distR="0" wp14:anchorId="433EF924" wp14:editId="472F75F9">
+            <wp:extent cx="6400800" cy="4137660"/>
+            <wp:effectExtent l="0" t="0" r="0" b="2540"/>
+            <wp:docPr id="1428720521" name="Picture 1"/>
+            <wp:cNvGraphicFramePr>
+              <a:graphicFrameLocks xmlns:a="http://schemas.openxmlformats.org/drawingml/2006/main" noChangeAspect="1"/>
+            </wp:cNvGraphicFramePr>
+            <a:graphic xmlns:a="http://schemas.openxmlformats.org/drawingml/2006/main">
+              <a:graphicData uri="http://schemas.openxmlformats.org/drawingml/2006/picture">
+                <pic:pic xmlns:pic="http://schemas.openxmlformats.org/drawingml/2006/picture">
+                  <pic:nvPicPr>
+                    <pic:cNvPr id="1428720521" name="Picture 1428720521"/>
+                    <pic:cNvPicPr/>
+                  </pic:nvPicPr>
+                  <pic:blipFill>
+                    <a:blip r:embed="rId14"/>
+                    <a:stretch>
+                      <a:fillRect/>
+                    </a:stretch>
+                  </pic:blipFill>
+                  <pic:spPr>
+                    <a:xfrm>
+                      <a:off x="0" y="0"/>
+                      <a:ext cx="6400800" cy="4137660"/>
+                    </a:xfrm>
+                    <a:prstGeom prst="rect">
+                      <a:avLst/>
+                    </a:prstGeom>
+                  </pic:spPr>
+                </pic:pic>
+              </a:graphicData>
+            </a:graphic>
+          </wp:inline>
+        </w:drawing>
+      </w:r>
+    </w:p>
+    <w:p>
+      <w:pPr>
+        <w:spacing w:before="80"/>
+      </w:pPr>
+      <w:r>
+        <w:rPr>
+          <w:noProof/>
+        </w:rPr>
+        <w:lastRenderedPageBreak/>
+        <w:drawing>
+          <wp:inline distT="0" distB="0" distL="0" distR="0" wp14:anchorId="13B98341" wp14:editId="03EF9686">
+            <wp:extent cx="6400800" cy="4137660"/>
+            <wp:effectExtent l="0" t="0" r="0" b="2540"/>
+            <wp:docPr id="1821300503" name="Picture 2"/>
+            <wp:cNvGraphicFramePr>
+              <a:graphicFrameLocks xmlns:a="http://schemas.openxmlformats.org/drawingml/2006/main" noChangeAspect="1"/>
+            </wp:cNvGraphicFramePr>
+            <a:graphic xmlns:a="http://schemas.openxmlformats.org/drawingml/2006/main">
+              <a:graphicData uri="http://schemas.openxmlformats.org/drawingml/2006/picture">
+                <pic:pic xmlns:pic="http://schemas.openxmlformats.org/drawingml/2006/picture">
+                  <pic:nvPicPr>
+                    <pic:cNvPr id="1821300503" name="Picture 1821300503"/>
+                    <pic:cNvPicPr/>
+                  </pic:nvPicPr>
+                  <pic:blipFill>
+                    <a:blip r:embed="rId15"/>
+                    <a:stretch>
+                      <a:fillRect/>
+                    </a:stretch>
+                  </pic:blipFill>
+                  <pic:spPr>
+                    <a:xfrm>
+                      <a:off x="0" y="0"/>
+                      <a:ext cx="6400800" cy="4137660"/>
+                    </a:xfrm>
+                    <a:prstGeom prst="rect">
+                      <a:avLst/>
+                    </a:prstGeom>
+                  </pic:spPr>
+                </pic:pic>
+              </a:graphicData>
+            </a:graphic>
+          </wp:inline>
+        </w:drawing>
+      </w:r>
+    </w:p>
+    <w:p>
+      <w:pPr>
+        <w:spacing w:before="80"/>
+      </w:pPr>
+      <w:r>
+        <w:rPr>
+          <w:noProof/>
+        </w:rPr>
+        <w:drawing>
+          <wp:inline distT="0" distB="0" distL="0" distR="0" wp14:anchorId="3BCF09C1" wp14:editId="7147B45B">
+            <wp:extent cx="6400800" cy="4137660"/>
+            <wp:effectExtent l="0" t="0" r="0" b="2540"/>
+            <wp:docPr id="997487112" name="Picture 3"/>
+            <wp:cNvGraphicFramePr>
+              <a:graphicFrameLocks xmlns:a="http://schemas.openxmlformats.org/drawingml/2006/main" noChangeAspect="1"/>
+            </wp:cNvGraphicFramePr>
+            <a:graphic xmlns:a="http://schemas.openxmlformats.org/drawingml/2006/main">
+              <a:graphicData uri="http://schemas.openxmlformats.org/drawingml/2006/picture">
+                <pic:pic xmlns:pic="http://schemas.openxmlformats.org/drawingml/2006/picture">
+                  <pic:nvPicPr>
+                    <pic:cNvPr id="997487112" name="Picture 997487112"/>
+                    <pic:cNvPicPr/>
+                  </pic:nvPicPr>
+                  <pic:blipFill>
+                    <a:blip r:embed="rId16"/>
+                    <a:stretch>
+                      <a:fillRect/>
+                    </a:stretch>
+                  </pic:blipFill>
+                  <pic:spPr>
+                    <a:xfrm>
+                      <a:off x="0" y="0"/>
+                      <a:ext cx="6400800" cy="4137660"/>
+                    </a:xfrm>
+                    <a:prstGeom prst="rect">
+                      <a:avLst/>
+                    </a:prstGeom>
+                  </pic:spPr>
+                </pic:pic>
+              </a:graphicData>
+            </a:graphic>
+          </wp:inline>
+        </w:drawing>
+      </w:r>
+    </w:p>
+    <w:p>
+      <w:pPr>
+        <w:spacing w:before="80"/>
+      </w:pPr>
+    </w:p>
+    <w:p>
+      <w:pPr>
+        <w:spacing w:before="80"/>
+      </w:pPr>
+      <w:r>
+        <w:rPr>
+          <w:noProof/>
+        </w:rPr>
+        <w:lastRenderedPageBreak/>
+        <w:drawing>
+          <wp:inline distT="0" distB="0" distL="0" distR="0" wp14:anchorId="41D779E1" wp14:editId="2E48CA93">
+            <wp:extent cx="6400800" cy="4137660"/>
+            <wp:effectExtent l="0" t="0" r="0" b="2540"/>
+            <wp:docPr id="520862475" name="Picture 4"/>
+            <wp:cNvGraphicFramePr>
+              <a:graphicFrameLocks xmlns:a="http://schemas.openxmlformats.org/drawingml/2006/main" noChangeAspect="1"/>
+            </wp:cNvGraphicFramePr>
+            <a:graphic xmlns:a="http://schemas.openxmlformats.org/drawingml/2006/main">
+              <a:graphicData uri="http://schemas.openxmlformats.org/drawingml/2006/picture">
+                <pic:pic xmlns:pic="http://schemas.openxmlformats.org/drawingml/2006/picture">
+                  <pic:nvPicPr>
+                    <pic:cNvPr id="520862475" name="Picture 520862475"/>
+                    <pic:cNvPicPr/>
+                  </pic:nvPicPr>
+                  <pic:blipFill>
+                    <a:blip r:embed="rId17"/>
+                    <a:stretch>
+                      <a:fillRect/>
+                    </a:stretch>
+                  </pic:blipFill>
+                  <pic:spPr>
+                    <a:xfrm>
+                      <a:off x="0" y="0"/>
+                      <a:ext cx="6400800" cy="4137660"/>
+                    </a:xfrm>
+                    <a:prstGeom prst="rect">
+                      <a:avLst/>
+                    </a:prstGeom>
+                  </pic:spPr>
+                </pic:pic>
+              </a:graphicData>
+            </a:graphic>
+          </wp:inline>
+        </w:drawing>
+      </w:r>
+    </w:p>
+    <w:p>
+      <w:pPr>
+        <w:spacing w:before="80"/>
+      </w:pPr>
+    </w:p>
+    <w:p>
+      <w:pPr>
+        <w:spacing w:before="80"/>
+        <w:rPr>
+          <w:lang w:val="es-ES"/>
+        </w:rPr>
+      </w:pPr>
+      <w:proofErr w:type="gramStart"/>
+      <w:r>
+        <w:rPr>
+          <w:lang w:val="es-ES"/>
+        </w:rPr>
+        <w:t>LINK</w:t>
+      </w:r>
+      <w:proofErr w:type="gramEnd"/>
+      <w:r>
+        <w:rPr>
+          <w:lang w:val="es-ES"/>
+        </w:rPr>
+        <w:t xml:space="preserve"> DEL </w:t>
+      </w:r>
+      <w:proofErr w:type="gramStart"/>
+      <w:r>
+        <w:rPr>
+          <w:lang w:val="es-ES"/>
+        </w:rPr>
+        <w:t>REPO :</w:t>
+      </w:r>
+      <w:proofErr w:type="gramEnd"/>
+      <w:r>
+        <w:rPr>
+          <w:lang w:val="es-ES"/>
+        </w:rPr>
+        <w:t xml:space="preserve"> </w:t>
+      </w:r>
+      <w:r>
+        <w:rPr>
+          <w:lang w:val="es-ES"/>
+        </w:rPr>
+        <w:t>https://github.com/FranderCT/una-chat</w:t>
+      </w:r>
     </w:p>
     <w:sectPr>
       <w:pgSz w:w="12240" w:h="15840"/>
@@ -2238,7 +2065,7 @@
 </file>
 
 <file path=word/numbering.xml><?xml version="1.0" encoding="utf-8"?>
-<w:numbering xmlns:wpc="http://schemas.microsoft.com/office/word/2010/wordprocessingCanvas" xmlns:cx="http://schemas.microsoft.com/office/drawing/2014/chartex" xmlns:cx1="http://schemas.microsoft.com/office/drawing/2015/9/8/chartex" xmlns:cx2="http://schemas.microsoft.com/office/drawing/2015/10/21/chartex" xmlns:cx3="http://schemas.microsoft.com/office/drawing/2016/5/9/chartex" xmlns:cx4="http://schemas.microsoft.com/office/drawing/2016/5/10/chartex" xmlns:cx5="http://schemas.microsoft.com/office/drawing/2016/5/11/chartex" xmlns:cx6="http://schemas.microsoft.com/office/drawing/2016/5/12/chartex" xmlns:cx7="http://schemas.microsoft.com/office/drawing/2016/5/13/chartex" xmlns:cx8="http://schemas.microsoft.com/office/drawing/2016/5/14/chartex" xmlns:mc="http://schemas.openxmlformats.org/markup-compatibility/2006" xmlns:aink="http://schemas.microsoft.com/office/drawing/2016/ink" xmlns:am3d="http://schemas.microsoft.com/office/drawing/2017/model3d" xmlns:o="urn:schemas-microsoft-com:office:office" xmlns:oel="http://schemas.microsoft.com/office/2019/extlst" xmlns:r="http://schemas.openxmlformats.org/officeDocument/2006/relationships" xmlns:m="http://schemas.openxmlformats.org/officeDocument/2006/math" xmlns:v="urn:schemas-microsoft-com:vml" xmlns:wp14="http://schemas.microsoft.com/office/word/2010/wordprocessingDrawing" xmlns:wp="http://schemas.openxmlformats.org/drawingml/2006/wordprocessingDrawing" xmlns:w10="urn:schemas-microsoft-com:office:word" xmlns:w="http://schemas.openxmlformats.org/wordprocessingml/2006/main" xmlns:w14="http://schemas.microsoft.com/office/word/2010/wordml" xmlns:w15="http://schemas.microsoft.com/office/word/2012/wordml" xmlns:w16cex="http://schemas.microsoft.com/office/word/2018/wordml/cex" xmlns:w16cid="http://schemas.microsoft.com/office/word/2016/wordml/cid" xmlns:w16="http://schemas.microsoft.com/office/word/2018/wordml" xmlns:w16du="http://schemas.microsoft.com/office/word/2023/wordml/word16du" xmlns:w16sdtdh="http://schemas.microsoft.com/office/word/2020/wordml/sdtdatahash" xmlns:w16sdtfl="http://schemas.microsoft.com/office/word/2024/wordml/sdtformatlock" xmlns:w16se="http://schemas.microsoft.com/office/word/2015/wordml/symex" xmlns:wpg="http://schemas.microsoft.com/office/word/2010/wordprocessingGroup" xmlns:wpi="http://schemas.microsoft.com/office/word/2010/wordprocessingInk" xmlns:wne="http://schemas.microsoft.com/office/word/2006/wordml" xmlns:wps="http://schemas.microsoft.com/office/word/2010/wordprocessingShape" mc:Ignorable="w14 w15 w16se w16cid w16 w16cex w16sdtdh w16sdtfl w16du wp14">
+<w:numbering xmlns:wpc="http://schemas.microsoft.com/office/word/2010/wordprocessingCanvas" xmlns:cx="http://schemas.microsoft.com/office/drawing/2014/chartex" xmlns:cx1="http://schemas.microsoft.com/office/drawing/2015/9/8/chartex" xmlns:cx2="http://schemas.microsoft.com/office/drawing/2015/10/21/chartex" xmlns:cx3="http://schemas.microsoft.com/office/drawing/2016/5/9/chartex" xmlns:cx4="http://schemas.microsoft.com/office/drawing/2016/5/10/chartex" xmlns:cx5="http://schemas.microsoft.com/office/drawing/2016/5/11/chartex" xmlns:cx6="http://schemas.microsoft.com/office/drawing/2016/5/12/chartex" xmlns:cx7="http://schemas.microsoft.com/office/drawing/2016/5/13/chartex" xmlns:cx8="http://schemas.microsoft.com/office/drawing/2016/5/14/chartex" xmlns:mc="http://schemas.openxmlformats.org/markup-compatibility/2006" xmlns:m="http://schemas.openxmlformats.org/officeDocument/2006/math" xmlns:aink="http://schemas.microsoft.com/office/drawing/2016/ink" xmlns:am3d="http://schemas.microsoft.com/office/drawing/2017/model3d" xmlns:oel="http://schemas.microsoft.com/office/2019/extlst" xmlns:r="http://schemas.openxmlformats.org/officeDocument/2006/relationships" xmlns:wp14="http://schemas.microsoft.com/office/word/2010/wordprocessingDrawing" xmlns:wp="http://schemas.openxmlformats.org/drawingml/2006/wordprocessingDrawing" xmlns:wpg="http://schemas.microsoft.com/office/word/2010/wordprocessingGroup" xmlns:wpi="http://schemas.microsoft.com/office/word/2010/wordprocessingInk" xmlns:wps="http://schemas.microsoft.com/office/word/2010/wordprocessingShape" xmlns:o="urn:schemas-microsoft-com:office:office" xmlns:v="urn:schemas-microsoft-com:vml" xmlns:w10="urn:schemas-microsoft-com:office:word" xmlns:w="http://schemas.openxmlformats.org/wordprocessingml/2006/main" xmlns:w14="http://schemas.microsoft.com/office/word/2010/wordml" xmlns:w15="http://schemas.microsoft.com/office/word/2012/wordml" xmlns:w16cex="http://schemas.microsoft.com/office/word/2018/wordml/cex" xmlns:w16cid="http://schemas.microsoft.com/office/word/2016/wordml/cid" xmlns:w16="http://schemas.microsoft.com/office/word/2018/wordml" xmlns:w16sdtdh="http://schemas.microsoft.com/office/word/2020/wordml/sdtdatahash" xmlns:w16sdtfl="http://schemas.microsoft.com/office/word/2024/wordml/sdtformatlock" xmlns:w16se="http://schemas.microsoft.com/office/word/2015/wordml/symex" xmlns:w16du="http://schemas.microsoft.com/office/word/2023/wordml/word16du" xmlns:wne="http://schemas.microsoft.com/office/word/2006/wordml" mc:Ignorable="w14 w15 w16se w16cid w16 w16cex w16sdtdh w16sdtfl w16du wp14">
   <w:abstractNum w:abstractNumId="0" w15:restartNumberingAfterBreak="0">
     <w:nsid w:val="FFFFFF7C"/>
     <w:multiLevelType w:val="singleLevel"/>
@@ -2441,7 +2268,7 @@
 </file>
 
 <file path=word/styles.xml><?xml version="1.0" encoding="utf-8"?>
-<w:styles xmlns:mc="http://schemas.openxmlformats.org/markup-compatibility/2006" xmlns:r="http://schemas.openxmlformats.org/officeDocument/2006/relationships" xmlns:w="http://schemas.openxmlformats.org/wordprocessingml/2006/main" xmlns:w14="http://schemas.microsoft.com/office/word/2010/wordml" xmlns:w15="http://schemas.microsoft.com/office/word/2012/wordml" xmlns:w16cex="http://schemas.microsoft.com/office/word/2018/wordml/cex" xmlns:w16cid="http://schemas.microsoft.com/office/word/2016/wordml/cid" xmlns:w16="http://schemas.microsoft.com/office/word/2018/wordml" xmlns:w16du="http://schemas.microsoft.com/office/word/2023/wordml/word16du" xmlns:w16sdtdh="http://schemas.microsoft.com/office/word/2020/wordml/sdtdatahash" xmlns:w16sdtfl="http://schemas.microsoft.com/office/word/2024/wordml/sdtformatlock" xmlns:w16se="http://schemas.microsoft.com/office/word/2015/wordml/symex" mc:Ignorable="w14 w15 w16se w16cid w16 w16cex w16sdtdh w16sdtfl w16du">
+<w:styles xmlns:mc="http://schemas.openxmlformats.org/markup-compatibility/2006" xmlns:r="http://schemas.openxmlformats.org/officeDocument/2006/relationships" xmlns:w="http://schemas.openxmlformats.org/wordprocessingml/2006/main" xmlns:w14="http://schemas.microsoft.com/office/word/2010/wordml" xmlns:w15="http://schemas.microsoft.com/office/word/2012/wordml" xmlns:w16cex="http://schemas.microsoft.com/office/word/2018/wordml/cex" xmlns:w16cid="http://schemas.microsoft.com/office/word/2016/wordml/cid" xmlns:w16="http://schemas.microsoft.com/office/word/2018/wordml" xmlns:w16sdtdh="http://schemas.microsoft.com/office/word/2020/wordml/sdtdatahash" xmlns:w16sdtfl="http://schemas.microsoft.com/office/word/2024/wordml/sdtformatlock" xmlns:w16se="http://schemas.microsoft.com/office/word/2015/wordml/symex" xmlns:w16du="http://schemas.microsoft.com/office/word/2023/wordml/word16du" mc:Ignorable="w14 w15 w16se w16cid w16 w16cex w16sdtdh w16sdtfl w16du">
   <w:docDefaults>
     <w:rPrDefault>
       <w:rPr>

</xml_diff>